<commit_message>
list and wirte with comment
</commit_message>
<xml_diff>
--- a/wbgt.docx
+++ b/wbgt.docx
@@ -1606,6 +1606,7 @@
       </w:pPr>
       <w:r>
         <w:rPr>
+          <w:noProof/>
           <w:lang w:val="nl-NL"/>
         </w:rPr>
         <w:lastRenderedPageBreak/>
@@ -1675,8 +1676,8 @@
         <w:tblLook w:val="04A0" w:firstRow="1" w:lastRow="0" w:firstColumn="1" w:lastColumn="0" w:noHBand="0" w:noVBand="1"/>
       </w:tblPr>
       <w:tblGrid>
-        <w:gridCol w:w="4139"/>
-        <w:gridCol w:w="4925"/>
+        <w:gridCol w:w="3986"/>
+        <w:gridCol w:w="5078"/>
       </w:tblGrid>
       <w:tr>
         <w:tc>
@@ -1740,7 +1741,19 @@
               <w:rPr>
                 <w:lang w:val="nl-NL"/>
               </w:rPr>
-              <w:t xml:space="preserve">een GitHub URL in te vullen. </w:t>
+              <w:t>een GitHub UR</w:t>
+            </w:r>
+            <w:r>
+              <w:rPr>
+                <w:lang w:val="nl-NL"/>
+              </w:rPr>
+              <w:t xml:space="preserve">L of een gebruikersnaam </w:t>
+            </w:r>
+            <w:r>
+              <w:rPr>
+                <w:lang w:val="nl-NL"/>
+              </w:rPr>
+              <w:t xml:space="preserve">in te vullen. </w:t>
             </w:r>
           </w:p>
           <w:p>
@@ -1761,54 +1774,30 @@
               <w:rPr>
                 <w:lang w:val="nl-NL"/>
               </w:rPr>
-              <w:t>Deze URL</w:t>
-            </w:r>
+              <w:t xml:space="preserve">Vul hier </w:t>
+            </w:r>
+            <w:proofErr w:type="gramStart"/>
             <w:r>
               <w:rPr>
                 <w:lang w:val="nl-NL"/>
               </w:rPr>
+              <w:t>in :</w:t>
+            </w:r>
+            <w:proofErr w:type="gramEnd"/>
+            <w:r>
+              <w:rPr>
+                <w:lang w:val="nl-NL"/>
+              </w:rPr>
               <w:t xml:space="preserve"> </w:t>
             </w:r>
+            <w:proofErr w:type="spellStart"/>
             <w:r>
               <w:rPr>
                 <w:lang w:val="nl-NL"/>
               </w:rPr>
-              <w:t>is:</w:t>
-            </w:r>
-          </w:p>
-          <w:p>
-            <w:pPr>
-              <w:rPr>
-                <w:lang w:val="nl-NL"/>
-              </w:rPr>
-            </w:pPr>
-          </w:p>
-          <w:p>
-            <w:pPr>
-              <w:rPr>
-                <w:lang w:val="nl-NL"/>
-              </w:rPr>
-            </w:pPr>
-            <w:proofErr w:type="gramStart"/>
-            <w:r>
-              <w:rPr>
-                <w:lang w:val="nl-NL"/>
-              </w:rPr>
-              <w:t>https://github.co</w:t>
-            </w:r>
-            <w:r>
-              <w:rPr>
-                <w:lang w:val="nl-NL"/>
-              </w:rPr>
-              <w:t>m</w:t>
-            </w:r>
-            <w:r>
-              <w:rPr>
-                <w:lang w:val="nl-NL"/>
-              </w:rPr>
-              <w:t>/JanMenssen/2026-wbgt</w:t>
-            </w:r>
-            <w:proofErr w:type="gramEnd"/>
+              <w:t>JanMenssen</w:t>
+            </w:r>
+            <w:proofErr w:type="spellEnd"/>
           </w:p>
           <w:p>
             <w:pPr>
@@ -1843,6 +1832,7 @@
             </w:pPr>
             <w:r>
               <w:rPr>
+                <w:noProof/>
                 <w:lang w:val="nl-NL"/>
               </w:rPr>
               <w:drawing>
@@ -2028,6 +2018,7 @@
             </w:pPr>
             <w:r>
               <w:rPr>
+                <w:noProof/>
                 <w:lang w:val="nl-NL"/>
               </w:rPr>
               <w:drawing>
@@ -2190,7 +2181,21 @@
         <w:rPr>
           <w:lang w:val="nl-NL"/>
         </w:rPr>
-        <w:t>&gt; een Jupyler Notebook. Een Jupyler Notebook bestaat uit cellen die te</w:t>
+        <w:t xml:space="preserve">&gt; een </w:t>
+      </w:r>
+      <w:proofErr w:type="spellStart"/>
+      <w:r>
+        <w:rPr>
+          <w:lang w:val="nl-NL"/>
+        </w:rPr>
+        <w:t>Jupyler</w:t>
+      </w:r>
+      <w:proofErr w:type="spellEnd"/>
+      <w:r>
+        <w:rPr>
+          <w:lang w:val="nl-NL"/>
+        </w:rPr>
+        <w:t xml:space="preserve"> Notebook. Een Jupyler Notebook bestaat uit cellen die te</w:t>
       </w:r>
       <w:r>
         <w:rPr>
@@ -2298,6 +2303,7 @@
       </w:pPr>
       <w:r>
         <w:rPr>
+          <w:noProof/>
           <w:lang w:val="nl-NL"/>
         </w:rPr>
         <w:drawing>
@@ -2801,94 +2807,36 @@
           <w:lang w:val="nl-NL"/>
         </w:rPr>
       </w:pPr>
-      <w:r>
-        <w:rPr>
-          <w:lang w:val="nl-NL"/>
-        </w:rPr>
-        <w:t>Selecteer de 3</w:t>
+      <w:proofErr w:type="spellStart"/>
+      <w:r>
+        <w:t>Selecteer</w:t>
+      </w:r>
+      <w:proofErr w:type="spellEnd"/>
+      <w:r>
+        <w:t xml:space="preserve"> de 3</w:t>
       </w:r>
       <w:r>
         <w:rPr>
           <w:vertAlign w:val="superscript"/>
-          <w:lang w:val="nl-NL"/>
         </w:rPr>
         <w:t>e</w:t>
       </w:r>
       <w:r>
-        <w:rPr>
-          <w:lang w:val="nl-NL"/>
-        </w:rPr>
-        <w:t xml:space="preserve"> </w:t>
+        <w:t xml:space="preserve"> cell (de cell </w:t>
       </w:r>
       <w:proofErr w:type="spellStart"/>
       <w:r>
-        <w:rPr>
-          <w:lang w:val="nl-NL"/>
-        </w:rPr>
-        <w:t>cell</w:t>
+        <w:t>onder</w:t>
       </w:r>
       <w:proofErr w:type="spellEnd"/>
       <w:r>
-        <w:rPr>
-          <w:lang w:val="nl-NL"/>
-        </w:rPr>
-        <w:t xml:space="preserve"> (de </w:t>
-      </w:r>
-      <w:proofErr w:type="spellStart"/>
-      <w:r>
-        <w:rPr>
-          <w:lang w:val="nl-NL"/>
-        </w:rPr>
-        <w:t>cell</w:t>
-      </w:r>
-      <w:proofErr w:type="spellEnd"/>
-      <w:r>
-        <w:rPr>
-          <w:lang w:val="nl-NL"/>
-        </w:rPr>
-        <w:t xml:space="preserve"> onder “</w:t>
-      </w:r>
-      <w:proofErr w:type="spellStart"/>
-      <w:r>
-        <w:rPr>
-          <w:lang w:val="nl-NL"/>
-        </w:rPr>
-        <w:t>and</w:t>
-      </w:r>
-      <w:proofErr w:type="spellEnd"/>
-      <w:r>
-        <w:rPr>
-          <w:lang w:val="nl-NL"/>
-        </w:rPr>
-        <w:t xml:space="preserve"> </w:t>
-      </w:r>
-      <w:proofErr w:type="spellStart"/>
-      <w:r>
-        <w:rPr>
-          <w:lang w:val="nl-NL"/>
-        </w:rPr>
-        <w:t>now</w:t>
-      </w:r>
-      <w:proofErr w:type="spellEnd"/>
-      <w:r>
-        <w:rPr>
-          <w:lang w:val="nl-NL"/>
-        </w:rPr>
-        <w:t xml:space="preserve"> run </w:t>
-      </w:r>
-      <w:proofErr w:type="spellStart"/>
-      <w:r>
-        <w:rPr>
-          <w:lang w:val="nl-NL"/>
-        </w:rPr>
-        <w:t>the</w:t>
-      </w:r>
-      <w:proofErr w:type="spellEnd"/>
-      <w:r>
-        <w:rPr>
-          <w:lang w:val="nl-NL"/>
-        </w:rPr>
-        <w:t xml:space="preserve"> code”. Er verschijnt een “</w:t>
+        <w:t xml:space="preserve"> “and now run the code”. </w:t>
+      </w:r>
+      <w:r>
+        <w:rPr>
+          <w:lang w:val="nl-NL"/>
+        </w:rPr>
+        <w:t>Er verschijnt een “</w:t>
       </w:r>
       <w:proofErr w:type="spellStart"/>
       <w:r>
@@ -3037,6 +2985,7 @@
       </w:pPr>
       <w:r>
         <w:rPr>
+          <w:noProof/>
           <w:lang w:val="nl-NL"/>
         </w:rPr>
         <w:drawing>
@@ -3406,7 +3355,7 @@
                   </a:prstGeom>
                   <a:extLst>
                     <a:ext uri="{FAA26D3D-D897-4be2-8F04-BA451C77F1D7}">
-                      <ma14:placeholderFlag xmlns:ma14="http://schemas.microsoft.com/office/mac/drawingml/2011/main" xmlns:w="http://schemas.openxmlformats.org/wordprocessingml/2006/main" xmlns:w10="urn:schemas-microsoft-com:office:word" xmlns:v="urn:schemas-microsoft-com:vml" xmlns:o="urn:schemas-microsoft-com:office:office" xmlns:mv="urn:schemas-microsoft-com:mac:vml" xmlns:mo="http://schemas.microsoft.com/office/mac/office/2008/main" xmlns="" xmlns:arto="http://schemas.microsoft.com/office/word/2006/arto"/>
+                      <ma14:placeholderFlag xmlns:arto="http://schemas.microsoft.com/office/word/2006/arto" xmlns="" xmlns:mo="http://schemas.microsoft.com/office/mac/office/2008/main" xmlns:mv="urn:schemas-microsoft-com:mac:vml" xmlns:o="urn:schemas-microsoft-com:office:office" xmlns:v="urn:schemas-microsoft-com:vml" xmlns:w10="urn:schemas-microsoft-com:office:word" xmlns:w="http://schemas.openxmlformats.org/wordprocessingml/2006/main" xmlns:ma14="http://schemas.microsoft.com/office/mac/drawingml/2011/main"/>
                     </a:ext>
                   </a:extLst>
                 </pic:spPr>
@@ -3732,7 +3681,7 @@
                   </a:prstGeom>
                   <a:extLst>
                     <a:ext uri="{FAA26D3D-D897-4be2-8F04-BA451C77F1D7}">
-                      <ma14:placeholderFlag xmlns:ma14="http://schemas.microsoft.com/office/mac/drawingml/2011/main" xmlns:w="http://schemas.openxmlformats.org/wordprocessingml/2006/main" xmlns:w10="urn:schemas-microsoft-com:office:word" xmlns:v="urn:schemas-microsoft-com:vml" xmlns:o="urn:schemas-microsoft-com:office:office" xmlns:mv="urn:schemas-microsoft-com:mac:vml" xmlns:mo="http://schemas.microsoft.com/office/mac/office/2008/main" xmlns="" xmlns:arto="http://schemas.microsoft.com/office/word/2006/arto"/>
+                      <ma14:placeholderFlag xmlns:arto="http://schemas.microsoft.com/office/word/2006/arto" xmlns="" xmlns:mo="http://schemas.microsoft.com/office/mac/office/2008/main" xmlns:mv="urn:schemas-microsoft-com:mac:vml" xmlns:o="urn:schemas-microsoft-com:office:office" xmlns:v="urn:schemas-microsoft-com:vml" xmlns:w10="urn:schemas-microsoft-com:office:word" xmlns:w="http://schemas.openxmlformats.org/wordprocessingml/2006/main" xmlns:ma14="http://schemas.microsoft.com/office/mac/drawingml/2011/main"/>
                     </a:ext>
                   </a:extLst>
                 </pic:spPr>
@@ -3882,7 +3831,7 @@
         <w:sz w:val="20"/>
         <w:szCs w:val="20"/>
       </w:rPr>
-      <w:t>25 July 2026</w:t>
+      <w:t>28 July 2026</w:t>
     </w:r>
     <w:r>
       <w:rPr>

</xml_diff>